<commit_message>
Registra o repositório do backend no GitHub nos documentos
</commit_message>
<xml_diff>
--- a/docs/HoverVoice-Documentacao-do-Software.docx
+++ b/docs/HoverVoice-Documentacao-do-Software.docx
@@ -800,17 +800,17 @@
                 <w:szCs w:val="19"/>
                 <w:shd w:fill="EEF3F6" w:color="auto" w:val="clear"/>
               </w:rPr>
-              <w:t xml:space="preserve">HoverVoice-backend</w:t>
-            </w:r>
-            <w:r>
-              <w:rPr>
-                <w:rFonts w:ascii="Arial" w:cs="Arial" w:eastAsia="Arial" w:hAnsi="Arial"/>
-                <w:b w:val="false"/>
-                <w:bCs w:val="false"/>
-                <w:sz w:val="19"/>
-                <w:szCs w:val="19"/>
-              </w:rPr>
-              <w:t xml:space="preserve"> (repositório separado)</w:t>
+              <w:t xml:space="preserve">MadureiraHenrique/HoverVoice-backend</w:t>
+            </w:r>
+            <w:r>
+              <w:rPr>
+                <w:rFonts w:ascii="Arial" w:cs="Arial" w:eastAsia="Arial" w:hAnsi="Arial"/>
+                <w:b w:val="false"/>
+                <w:bCs w:val="false"/>
+                <w:sz w:val="19"/>
+                <w:szCs w:val="19"/>
+              </w:rPr>
+              <w:t xml:space="preserve"> (repositório separado, privado)</w:t>
             </w:r>
           </w:p>
         </w:tc>

</xml_diff>

<commit_message>
Documenta o modo demonstração do login e regenera os documentos
</commit_message>
<xml_diff>
--- a/docs/HoverVoice-Documentacao-do-Software.docx
+++ b/docs/HoverVoice-Documentacao-do-Software.docx
@@ -761,7 +761,7 @@
           <w:sz w:val="21"/>
           <w:szCs w:val="21"/>
         </w:rPr>
-        <w:t xml:space="preserve">O HoverVoice é uma extensão de navegador que narra em voz alta o conteúdo de páginas web e de PDFs enquanto a pessoa passa o cursor ou navega com o teclado, para ampliar a autonomia de quem tem deficiência visual ou baixa visão. A interface e a voz funcionam em português, inglês e espanhol. Uma conta com Google, totalmente opcional, permite levar as preferências de voz para outro navegador; esse recurso está pronto, mas </w:t>
+        <w:t xml:space="preserve">O HoverVoice é uma extensão de navegador que narra em voz alta o conteúdo de páginas web e de PDFs enquanto a pessoa passa o cursor ou navega com o teclado, para ampliar a autonomia de quem tem deficiência visual ou baixa visão. A interface e a voz funcionam em português, inglês e espanhol. Uma conta com Google, totalmente opcional, permite levar as preferências de voz para outro navegador; esse recurso está pronto e roda em </w:t>
       </w:r>
       <w:r>
         <w:rPr>
@@ -772,16 +772,16 @@
           <w:sz w:val="21"/>
           <w:szCs w:val="21"/>
         </w:rPr>
-        <w:t xml:space="preserve">desativado</w:t>
-      </w:r>
-      <w:r>
-        <w:rPr>
-          <w:rFonts w:ascii="Segoe UI" w:cs="Segoe UI" w:eastAsia="Segoe UI" w:hAnsi="Segoe UI"/>
-          <w:color w:val="1C2733"/>
-          <w:sz w:val="21"/>
-          <w:szCs w:val="21"/>
-        </w:rPr>
-        <w:t xml:space="preserve"> até a configuração do Google Cloud (seção 9).</w:t>
+        <w:t xml:space="preserve">modo demonstração</w:t>
+      </w:r>
+      <w:r>
+        <w:rPr>
+          <w:rFonts w:ascii="Segoe UI" w:cs="Segoe UI" w:eastAsia="Segoe UI" w:hAnsi="Segoe UI"/>
+          <w:color w:val="1C2733"/>
+          <w:sz w:val="21"/>
+          <w:szCs w:val="21"/>
+        </w:rPr>
+        <w:t xml:space="preserve"> (login simulado) até a configuração do Google Cloud (seção 9).</w:t>
       </w:r>
     </w:p>
     <w:p>
@@ -3879,7 +3879,7 @@
                 <w:sz w:val="18"/>
                 <w:szCs w:val="18"/>
               </w:rPr>
-              <w:t xml:space="preserve">Entrar ou criar conta com o Google, de forma opcional; sem Client ID configurado, o cartão de conta fica oculto</w:t>
+              <w:t xml:space="preserve">Entrar ou criar conta com o Google, de forma opcional; sem Client ID configurado, o login é simulado em modo demonstração (conta fictícia, etiqueta "Demonstração", sem rede)</w:t>
             </w:r>
           </w:p>
         </w:tc>
@@ -12816,7 +12816,7 @@
                 <w:sz w:val="18"/>
                 <w:szCs w:val="18"/>
               </w:rPr>
-              <w:t xml:space="preserve">Não aparece a opção de entrar</w:t>
+              <w:t xml:space="preserve">O login mostra "Demonstração"</w:t>
             </w:r>
           </w:p>
         </w:tc>
@@ -12882,7 +12882,7 @@
                 <w:sz w:val="18"/>
                 <w:szCs w:val="18"/>
               </w:rPr>
-              <w:t xml:space="preserve">Esperado: a extensão segue com as preferências locais. Para ativar, siga "Configuração do login"</w:t>
+              <w:t xml:space="preserve">Esperado: o login é simulado e nada sai do navegador. Para o login real, siga "Configuração do login"</w:t>
             </w:r>
           </w:p>
         </w:tc>
@@ -16543,7 +16543,7 @@
           <w:sz w:val="21"/>
           <w:szCs w:val="21"/>
         </w:rPr>
-        <w:t xml:space="preserve"> o login está implementado e testado com o Google simulado, mas </w:t>
+        <w:t xml:space="preserve"> o login real está implementado e testado com o Google simulado, e a extensão roda em </w:t>
       </w:r>
       <w:r>
         <w:rPr>
@@ -16554,7 +16554,7 @@
           <w:sz w:val="21"/>
           <w:szCs w:val="21"/>
         </w:rPr>
-        <w:t xml:space="preserve">desativado</w:t>
+        <w:t xml:space="preserve">modo demonstração</w:t>
       </w:r>
       <w:r>
         <w:rPr>
@@ -16601,7 +16601,26 @@
           <w:sz w:val="21"/>
           <w:szCs w:val="21"/>
         </w:rPr>
-        <w:t xml:space="preserve">, o cartão de conta não aparece no popup e a extensão usa só preferências locais. Alguém com conta no Google Cloud pode criar o projeto e entregar o Client ID.</w:t>
+        <w:t xml:space="preserve">, o login é simulado localmente: conta fictícia </w:t>
+      </w:r>
+      <w:r>
+        <w:rPr>
+          <w:rFonts w:ascii="Consolas" w:cs="Consolas" w:eastAsia="Consolas" w:hAnsi="Consolas"/>
+          <w:color w:val="0B4D6C"/>
+          <w:sz w:val="19"/>
+          <w:szCs w:val="19"/>
+          <w:shd w:fill="EAF3F8" w:color="auto" w:val="clear"/>
+        </w:rPr>
+        <w:t xml:space="preserve">demo@hovervoice.dev</w:t>
+      </w:r>
+      <w:r>
+        <w:rPr>
+          <w:rFonts w:ascii="Segoe UI" w:cs="Segoe UI" w:eastAsia="Segoe UI" w:hAnsi="Segoe UI"/>
+          <w:color w:val="1C2733"/>
+          <w:sz w:val="21"/>
+          <w:szCs w:val="21"/>
+        </w:rPr>
+        <w:t xml:space="preserve">, etiqueta "Demonstração", preferências guardadas só no navegador e nenhuma requisição de rede. Ao preencher o Client ID, o login real assume sozinho. Alguém com conta no Google Cloud pode criar o projeto e entregar o Client ID.</w:t>
       </w:r>
     </w:p>
     <w:p>

</xml_diff>